<commit_message>
actualizacion de clases realizadas por alumnos
</commit_message>
<xml_diff>
--- a/material-adicional/plantilla-de-clase.docx
+++ b/material-adicional/plantilla-de-clase.docx
@@ -18,6 +18,70 @@
         <w:rPr>
           <w:rFonts w:ascii="Times New Roman" w:hAnsi="Times New Roman" w:cs="Times New Roman"/>
           <w:b/>
+          <w:noProof/>
+          <w:sz w:val="32"/>
+          <w:szCs w:val="32"/>
+        </w:rPr>
+        <w:drawing>
+          <wp:anchor distT="0" distB="0" distL="114300" distR="114300" simplePos="0" relativeHeight="251660288" behindDoc="0" locked="0" layoutInCell="1" allowOverlap="1" wp14:anchorId="7E7BC146" wp14:editId="6CB2892C">
+            <wp:simplePos x="0" y="0"/>
+            <wp:positionH relativeFrom="margin">
+              <wp:align>center</wp:align>
+            </wp:positionH>
+            <wp:positionV relativeFrom="paragraph">
+              <wp:posOffset>-695079</wp:posOffset>
+            </wp:positionV>
+            <wp:extent cx="634621" cy="634621"/>
+            <wp:effectExtent l="0" t="0" r="0" b="0"/>
+            <wp:wrapNone/>
+            <wp:docPr id="2" name="Imagen 2"/>
+            <wp:cNvGraphicFramePr>
+              <a:graphicFrameLocks xmlns:a="http://schemas.openxmlformats.org/drawingml/2006/main" noChangeAspect="1"/>
+            </wp:cNvGraphicFramePr>
+            <a:graphic xmlns:a="http://schemas.openxmlformats.org/drawingml/2006/main">
+              <a:graphicData uri="http://schemas.openxmlformats.org/drawingml/2006/picture">
+                <pic:pic xmlns:pic="http://schemas.openxmlformats.org/drawingml/2006/picture">
+                  <pic:nvPicPr>
+                    <pic:cNvPr id="2" name="logo_uba_xxii.png"/>
+                    <pic:cNvPicPr/>
+                  </pic:nvPicPr>
+                  <pic:blipFill>
+                    <a:blip r:embed="rId6" cstate="print">
+                      <a:extLst>
+                        <a:ext uri="{28A0092B-C50C-407E-A947-70E740481C1C}">
+                          <a14:useLocalDpi xmlns:a14="http://schemas.microsoft.com/office/drawing/2010/main" val="0"/>
+                        </a:ext>
+                      </a:extLst>
+                    </a:blip>
+                    <a:stretch>
+                      <a:fillRect/>
+                    </a:stretch>
+                  </pic:blipFill>
+                  <pic:spPr>
+                    <a:xfrm>
+                      <a:off x="0" y="0"/>
+                      <a:ext cx="634621" cy="634621"/>
+                    </a:xfrm>
+                    <a:prstGeom prst="rect">
+                      <a:avLst/>
+                    </a:prstGeom>
+                  </pic:spPr>
+                </pic:pic>
+              </a:graphicData>
+            </a:graphic>
+            <wp14:sizeRelH relativeFrom="margin">
+              <wp14:pctWidth>0</wp14:pctWidth>
+            </wp14:sizeRelH>
+            <wp14:sizeRelV relativeFrom="margin">
+              <wp14:pctHeight>0</wp14:pctHeight>
+            </wp14:sizeRelV>
+          </wp:anchor>
+        </w:drawing>
+      </w:r>
+      <w:r>
+        <w:rPr>
+          <w:rFonts w:ascii="Times New Roman" w:hAnsi="Times New Roman" w:cs="Times New Roman"/>
+          <w:b/>
           <w:sz w:val="32"/>
           <w:szCs w:val="32"/>
           <w:lang w:val="es-ES"/>
@@ -75,6 +139,15 @@
           <w:szCs w:val="24"/>
           <w:lang w:val="es-ES"/>
         </w:rPr>
+        <w:t xml:space="preserve"> </w:t>
+      </w:r>
+      <w:r>
+        <w:rPr>
+          <w:rFonts w:ascii="Times New Roman" w:hAnsi="Times New Roman" w:cs="Times New Roman"/>
+          <w:sz w:val="24"/>
+          <w:szCs w:val="24"/>
+          <w:lang w:val="es-ES"/>
+        </w:rPr>
         <w:t>- UBA</w:t>
       </w:r>
     </w:p>
@@ -107,896 +180,7 @@
           <w:szCs w:val="24"/>
           <w:lang w:val="es-ES"/>
         </w:rPr>
-        <w:t>Clase de hoy: texto</w:t>
-      </w:r>
-      <w:r>
-        <w:rPr>
-          <w:rFonts w:ascii="Times New Roman" w:hAnsi="Times New Roman" w:cs="Times New Roman"/>
-          <w:sz w:val="24"/>
-          <w:szCs w:val="24"/>
-          <w:lang w:val="es-ES"/>
-        </w:rPr>
-        <w:t xml:space="preserve"> </w:t>
-      </w:r>
-      <w:proofErr w:type="spellStart"/>
-      <w:r>
-        <w:rPr>
-          <w:rFonts w:ascii="Times New Roman" w:hAnsi="Times New Roman" w:cs="Times New Roman"/>
-          <w:sz w:val="24"/>
-          <w:szCs w:val="24"/>
-          <w:lang w:val="es-ES"/>
-        </w:rPr>
-        <w:t>texto</w:t>
-      </w:r>
-      <w:proofErr w:type="spellEnd"/>
-      <w:r>
-        <w:rPr>
-          <w:rFonts w:ascii="Times New Roman" w:hAnsi="Times New Roman" w:cs="Times New Roman"/>
-          <w:sz w:val="24"/>
-          <w:szCs w:val="24"/>
-          <w:lang w:val="es-ES"/>
-        </w:rPr>
-        <w:t xml:space="preserve"> </w:t>
-      </w:r>
-      <w:proofErr w:type="spellStart"/>
-      <w:r>
-        <w:rPr>
-          <w:rFonts w:ascii="Times New Roman" w:hAnsi="Times New Roman" w:cs="Times New Roman"/>
-          <w:sz w:val="24"/>
-          <w:szCs w:val="24"/>
-          <w:lang w:val="es-ES"/>
-        </w:rPr>
-        <w:t>texto</w:t>
-      </w:r>
-      <w:proofErr w:type="spellEnd"/>
-      <w:r>
-        <w:rPr>
-          <w:rFonts w:ascii="Times New Roman" w:hAnsi="Times New Roman" w:cs="Times New Roman"/>
-          <w:sz w:val="24"/>
-          <w:szCs w:val="24"/>
-          <w:lang w:val="es-ES"/>
-        </w:rPr>
-        <w:t xml:space="preserve"> </w:t>
-      </w:r>
-      <w:proofErr w:type="spellStart"/>
-      <w:r>
-        <w:rPr>
-          <w:rFonts w:ascii="Times New Roman" w:hAnsi="Times New Roman" w:cs="Times New Roman"/>
-          <w:sz w:val="24"/>
-          <w:szCs w:val="24"/>
-          <w:lang w:val="es-ES"/>
-        </w:rPr>
-        <w:t>texto</w:t>
-      </w:r>
-      <w:proofErr w:type="spellEnd"/>
-      <w:r>
-        <w:rPr>
-          <w:rFonts w:ascii="Times New Roman" w:hAnsi="Times New Roman" w:cs="Times New Roman"/>
-          <w:sz w:val="24"/>
-          <w:szCs w:val="24"/>
-          <w:lang w:val="es-ES"/>
-        </w:rPr>
-        <w:t xml:space="preserve"> </w:t>
-      </w:r>
-      <w:proofErr w:type="spellStart"/>
-      <w:r>
-        <w:rPr>
-          <w:rFonts w:ascii="Times New Roman" w:hAnsi="Times New Roman" w:cs="Times New Roman"/>
-          <w:sz w:val="24"/>
-          <w:szCs w:val="24"/>
-          <w:lang w:val="es-ES"/>
-        </w:rPr>
-        <w:t>texto</w:t>
-      </w:r>
-      <w:proofErr w:type="spellEnd"/>
-      <w:r>
-        <w:rPr>
-          <w:rFonts w:ascii="Times New Roman" w:hAnsi="Times New Roman" w:cs="Times New Roman"/>
-          <w:sz w:val="24"/>
-          <w:szCs w:val="24"/>
-          <w:lang w:val="es-ES"/>
-        </w:rPr>
-        <w:t xml:space="preserve"> </w:t>
-      </w:r>
-      <w:proofErr w:type="spellStart"/>
-      <w:r>
-        <w:rPr>
-          <w:rFonts w:ascii="Times New Roman" w:hAnsi="Times New Roman" w:cs="Times New Roman"/>
-          <w:sz w:val="24"/>
-          <w:szCs w:val="24"/>
-          <w:lang w:val="es-ES"/>
-        </w:rPr>
-        <w:t>texto</w:t>
-      </w:r>
-      <w:proofErr w:type="spellEnd"/>
-      <w:r>
-        <w:rPr>
-          <w:rFonts w:ascii="Times New Roman" w:hAnsi="Times New Roman" w:cs="Times New Roman"/>
-          <w:sz w:val="24"/>
-          <w:szCs w:val="24"/>
-          <w:lang w:val="es-ES"/>
-        </w:rPr>
-        <w:t xml:space="preserve"> </w:t>
-      </w:r>
-      <w:proofErr w:type="spellStart"/>
-      <w:r>
-        <w:rPr>
-          <w:rFonts w:ascii="Times New Roman" w:hAnsi="Times New Roman" w:cs="Times New Roman"/>
-          <w:sz w:val="24"/>
-          <w:szCs w:val="24"/>
-          <w:lang w:val="es-ES"/>
-        </w:rPr>
-        <w:t>texto</w:t>
-      </w:r>
-      <w:proofErr w:type="spellEnd"/>
-      <w:r>
-        <w:rPr>
-          <w:rFonts w:ascii="Times New Roman" w:hAnsi="Times New Roman" w:cs="Times New Roman"/>
-          <w:sz w:val="24"/>
-          <w:szCs w:val="24"/>
-          <w:lang w:val="es-ES"/>
-        </w:rPr>
-        <w:t xml:space="preserve"> </w:t>
-      </w:r>
-      <w:proofErr w:type="spellStart"/>
-      <w:r>
-        <w:rPr>
-          <w:rFonts w:ascii="Times New Roman" w:hAnsi="Times New Roman" w:cs="Times New Roman"/>
-          <w:sz w:val="24"/>
-          <w:szCs w:val="24"/>
-          <w:lang w:val="es-ES"/>
-        </w:rPr>
-        <w:t>texto</w:t>
-      </w:r>
-      <w:proofErr w:type="spellEnd"/>
-      <w:r>
-        <w:rPr>
-          <w:rFonts w:ascii="Times New Roman" w:hAnsi="Times New Roman" w:cs="Times New Roman"/>
-          <w:sz w:val="24"/>
-          <w:szCs w:val="24"/>
-          <w:lang w:val="es-ES"/>
-        </w:rPr>
-        <w:t xml:space="preserve"> </w:t>
-      </w:r>
-      <w:proofErr w:type="spellStart"/>
-      <w:r>
-        <w:rPr>
-          <w:rFonts w:ascii="Times New Roman" w:hAnsi="Times New Roman" w:cs="Times New Roman"/>
-          <w:sz w:val="24"/>
-          <w:szCs w:val="24"/>
-          <w:lang w:val="es-ES"/>
-        </w:rPr>
-        <w:t>texto</w:t>
-      </w:r>
-      <w:proofErr w:type="spellEnd"/>
-      <w:r>
-        <w:rPr>
-          <w:rFonts w:ascii="Times New Roman" w:hAnsi="Times New Roman" w:cs="Times New Roman"/>
-          <w:sz w:val="24"/>
-          <w:szCs w:val="24"/>
-          <w:lang w:val="es-ES"/>
-        </w:rPr>
-        <w:t xml:space="preserve"> </w:t>
-      </w:r>
-      <w:proofErr w:type="spellStart"/>
-      <w:r>
-        <w:rPr>
-          <w:rFonts w:ascii="Times New Roman" w:hAnsi="Times New Roman" w:cs="Times New Roman"/>
-          <w:sz w:val="24"/>
-          <w:szCs w:val="24"/>
-          <w:lang w:val="es-ES"/>
-        </w:rPr>
-        <w:t>texto</w:t>
-      </w:r>
-      <w:proofErr w:type="spellEnd"/>
-      <w:r>
-        <w:rPr>
-          <w:rFonts w:ascii="Times New Roman" w:hAnsi="Times New Roman" w:cs="Times New Roman"/>
-          <w:sz w:val="24"/>
-          <w:szCs w:val="24"/>
-          <w:lang w:val="es-ES"/>
-        </w:rPr>
-        <w:t xml:space="preserve"> </w:t>
-      </w:r>
-      <w:proofErr w:type="spellStart"/>
-      <w:r>
-        <w:rPr>
-          <w:rFonts w:ascii="Times New Roman" w:hAnsi="Times New Roman" w:cs="Times New Roman"/>
-          <w:sz w:val="24"/>
-          <w:szCs w:val="24"/>
-          <w:lang w:val="es-ES"/>
-        </w:rPr>
-        <w:t>texto</w:t>
-      </w:r>
-      <w:proofErr w:type="spellEnd"/>
-      <w:r>
-        <w:rPr>
-          <w:rFonts w:ascii="Times New Roman" w:hAnsi="Times New Roman" w:cs="Times New Roman"/>
-          <w:sz w:val="24"/>
-          <w:szCs w:val="24"/>
-          <w:lang w:val="es-ES"/>
-        </w:rPr>
-        <w:t xml:space="preserve"> </w:t>
-      </w:r>
-      <w:proofErr w:type="spellStart"/>
-      <w:r>
-        <w:rPr>
-          <w:rFonts w:ascii="Times New Roman" w:hAnsi="Times New Roman" w:cs="Times New Roman"/>
-          <w:sz w:val="24"/>
-          <w:szCs w:val="24"/>
-          <w:lang w:val="es-ES"/>
-        </w:rPr>
-        <w:t>texto</w:t>
-      </w:r>
-      <w:proofErr w:type="spellEnd"/>
-      <w:r>
-        <w:rPr>
-          <w:rFonts w:ascii="Times New Roman" w:hAnsi="Times New Roman" w:cs="Times New Roman"/>
-          <w:sz w:val="24"/>
-          <w:szCs w:val="24"/>
-          <w:lang w:val="es-ES"/>
-        </w:rPr>
-        <w:t xml:space="preserve"> </w:t>
-      </w:r>
-      <w:proofErr w:type="spellStart"/>
-      <w:r>
-        <w:rPr>
-          <w:rFonts w:ascii="Times New Roman" w:hAnsi="Times New Roman" w:cs="Times New Roman"/>
-          <w:sz w:val="24"/>
-          <w:szCs w:val="24"/>
-          <w:lang w:val="es-ES"/>
-        </w:rPr>
-        <w:t>texto</w:t>
-      </w:r>
-      <w:proofErr w:type="spellEnd"/>
-      <w:r>
-        <w:rPr>
-          <w:rFonts w:ascii="Times New Roman" w:hAnsi="Times New Roman" w:cs="Times New Roman"/>
-          <w:sz w:val="24"/>
-          <w:szCs w:val="24"/>
-          <w:lang w:val="es-ES"/>
-        </w:rPr>
-        <w:t xml:space="preserve"> </w:t>
-      </w:r>
-      <w:proofErr w:type="spellStart"/>
-      <w:r>
-        <w:rPr>
-          <w:rFonts w:ascii="Times New Roman" w:hAnsi="Times New Roman" w:cs="Times New Roman"/>
-          <w:sz w:val="24"/>
-          <w:szCs w:val="24"/>
-          <w:lang w:val="es-ES"/>
-        </w:rPr>
-        <w:t>texto</w:t>
-      </w:r>
-      <w:proofErr w:type="spellEnd"/>
-      <w:r>
-        <w:rPr>
-          <w:rFonts w:ascii="Times New Roman" w:hAnsi="Times New Roman" w:cs="Times New Roman"/>
-          <w:sz w:val="24"/>
-          <w:szCs w:val="24"/>
-          <w:lang w:val="es-ES"/>
-        </w:rPr>
-        <w:t xml:space="preserve"> </w:t>
-      </w:r>
-      <w:proofErr w:type="spellStart"/>
-      <w:r>
-        <w:rPr>
-          <w:rFonts w:ascii="Times New Roman" w:hAnsi="Times New Roman" w:cs="Times New Roman"/>
-          <w:sz w:val="24"/>
-          <w:szCs w:val="24"/>
-          <w:lang w:val="es-ES"/>
-        </w:rPr>
-        <w:t>texto</w:t>
-      </w:r>
-      <w:proofErr w:type="spellEnd"/>
-      <w:r>
-        <w:rPr>
-          <w:rFonts w:ascii="Times New Roman" w:hAnsi="Times New Roman" w:cs="Times New Roman"/>
-          <w:sz w:val="24"/>
-          <w:szCs w:val="24"/>
-          <w:lang w:val="es-ES"/>
-        </w:rPr>
-        <w:t xml:space="preserve"> </w:t>
-      </w:r>
-      <w:proofErr w:type="spellStart"/>
-      <w:r>
-        <w:rPr>
-          <w:rFonts w:ascii="Times New Roman" w:hAnsi="Times New Roman" w:cs="Times New Roman"/>
-          <w:sz w:val="24"/>
-          <w:szCs w:val="24"/>
-          <w:lang w:val="es-ES"/>
-        </w:rPr>
-        <w:t>texto</w:t>
-      </w:r>
-      <w:proofErr w:type="spellEnd"/>
-      <w:r>
-        <w:rPr>
-          <w:rFonts w:ascii="Times New Roman" w:hAnsi="Times New Roman" w:cs="Times New Roman"/>
-          <w:sz w:val="24"/>
-          <w:szCs w:val="24"/>
-          <w:lang w:val="es-ES"/>
-        </w:rPr>
-        <w:t xml:space="preserve"> </w:t>
-      </w:r>
-      <w:proofErr w:type="spellStart"/>
-      <w:r>
-        <w:rPr>
-          <w:rFonts w:ascii="Times New Roman" w:hAnsi="Times New Roman" w:cs="Times New Roman"/>
-          <w:sz w:val="24"/>
-          <w:szCs w:val="24"/>
-          <w:lang w:val="es-ES"/>
-        </w:rPr>
-        <w:t>texto</w:t>
-      </w:r>
-      <w:proofErr w:type="spellEnd"/>
-      <w:r>
-        <w:rPr>
-          <w:rFonts w:ascii="Times New Roman" w:hAnsi="Times New Roman" w:cs="Times New Roman"/>
-          <w:sz w:val="24"/>
-          <w:szCs w:val="24"/>
-          <w:lang w:val="es-ES"/>
-        </w:rPr>
-        <w:t xml:space="preserve"> </w:t>
-      </w:r>
-      <w:proofErr w:type="spellStart"/>
-      <w:r>
-        <w:rPr>
-          <w:rFonts w:ascii="Times New Roman" w:hAnsi="Times New Roman" w:cs="Times New Roman"/>
-          <w:sz w:val="24"/>
-          <w:szCs w:val="24"/>
-          <w:lang w:val="es-ES"/>
-        </w:rPr>
-        <w:t>texto</w:t>
-      </w:r>
-      <w:proofErr w:type="spellEnd"/>
-      <w:r>
-        <w:rPr>
-          <w:rFonts w:ascii="Times New Roman" w:hAnsi="Times New Roman" w:cs="Times New Roman"/>
-          <w:sz w:val="24"/>
-          <w:szCs w:val="24"/>
-          <w:lang w:val="es-ES"/>
-        </w:rPr>
-        <w:t xml:space="preserve"> </w:t>
-      </w:r>
-      <w:proofErr w:type="spellStart"/>
-      <w:r>
-        <w:rPr>
-          <w:rFonts w:ascii="Times New Roman" w:hAnsi="Times New Roman" w:cs="Times New Roman"/>
-          <w:sz w:val="24"/>
-          <w:szCs w:val="24"/>
-          <w:lang w:val="es-ES"/>
-        </w:rPr>
-        <w:t>texto</w:t>
-      </w:r>
-      <w:proofErr w:type="spellEnd"/>
-      <w:r>
-        <w:rPr>
-          <w:rFonts w:ascii="Times New Roman" w:hAnsi="Times New Roman" w:cs="Times New Roman"/>
-          <w:sz w:val="24"/>
-          <w:szCs w:val="24"/>
-          <w:lang w:val="es-ES"/>
-        </w:rPr>
-        <w:t xml:space="preserve"> </w:t>
-      </w:r>
-      <w:proofErr w:type="spellStart"/>
-      <w:r>
-        <w:rPr>
-          <w:rFonts w:ascii="Times New Roman" w:hAnsi="Times New Roman" w:cs="Times New Roman"/>
-          <w:sz w:val="24"/>
-          <w:szCs w:val="24"/>
-          <w:lang w:val="es-ES"/>
-        </w:rPr>
-        <w:t>texto</w:t>
-      </w:r>
-      <w:proofErr w:type="spellEnd"/>
-      <w:r>
-        <w:rPr>
-          <w:rFonts w:ascii="Times New Roman" w:hAnsi="Times New Roman" w:cs="Times New Roman"/>
-          <w:sz w:val="24"/>
-          <w:szCs w:val="24"/>
-          <w:lang w:val="es-ES"/>
-        </w:rPr>
-        <w:t xml:space="preserve"> </w:t>
-      </w:r>
-      <w:proofErr w:type="spellStart"/>
-      <w:r>
-        <w:rPr>
-          <w:rFonts w:ascii="Times New Roman" w:hAnsi="Times New Roman" w:cs="Times New Roman"/>
-          <w:sz w:val="24"/>
-          <w:szCs w:val="24"/>
-          <w:lang w:val="es-ES"/>
-        </w:rPr>
-        <w:t>texto</w:t>
-      </w:r>
-      <w:proofErr w:type="spellEnd"/>
-      <w:r>
-        <w:rPr>
-          <w:rFonts w:ascii="Times New Roman" w:hAnsi="Times New Roman" w:cs="Times New Roman"/>
-          <w:sz w:val="24"/>
-          <w:szCs w:val="24"/>
-          <w:lang w:val="es-ES"/>
-        </w:rPr>
-        <w:t xml:space="preserve"> </w:t>
-      </w:r>
-      <w:proofErr w:type="spellStart"/>
-      <w:r>
-        <w:rPr>
-          <w:rFonts w:ascii="Times New Roman" w:hAnsi="Times New Roman" w:cs="Times New Roman"/>
-          <w:sz w:val="24"/>
-          <w:szCs w:val="24"/>
-          <w:lang w:val="es-ES"/>
-        </w:rPr>
-        <w:t>texto</w:t>
-      </w:r>
-      <w:proofErr w:type="spellEnd"/>
-      <w:r>
-        <w:rPr>
-          <w:rFonts w:ascii="Times New Roman" w:hAnsi="Times New Roman" w:cs="Times New Roman"/>
-          <w:sz w:val="24"/>
-          <w:szCs w:val="24"/>
-          <w:lang w:val="es-ES"/>
-        </w:rPr>
-        <w:t xml:space="preserve"> </w:t>
-      </w:r>
-      <w:proofErr w:type="spellStart"/>
-      <w:r>
-        <w:rPr>
-          <w:rFonts w:ascii="Times New Roman" w:hAnsi="Times New Roman" w:cs="Times New Roman"/>
-          <w:sz w:val="24"/>
-          <w:szCs w:val="24"/>
-          <w:lang w:val="es-ES"/>
-        </w:rPr>
-        <w:t>texto</w:t>
-      </w:r>
-      <w:proofErr w:type="spellEnd"/>
-      <w:r>
-        <w:rPr>
-          <w:rFonts w:ascii="Times New Roman" w:hAnsi="Times New Roman" w:cs="Times New Roman"/>
-          <w:sz w:val="24"/>
-          <w:szCs w:val="24"/>
-          <w:lang w:val="es-ES"/>
-        </w:rPr>
-        <w:t xml:space="preserve"> </w:t>
-      </w:r>
-      <w:proofErr w:type="spellStart"/>
-      <w:r>
-        <w:rPr>
-          <w:rFonts w:ascii="Times New Roman" w:hAnsi="Times New Roman" w:cs="Times New Roman"/>
-          <w:sz w:val="24"/>
-          <w:szCs w:val="24"/>
-          <w:lang w:val="es-ES"/>
-        </w:rPr>
-        <w:t>texto</w:t>
-      </w:r>
-      <w:proofErr w:type="spellEnd"/>
-      <w:r>
-        <w:rPr>
-          <w:rFonts w:ascii="Times New Roman" w:hAnsi="Times New Roman" w:cs="Times New Roman"/>
-          <w:sz w:val="24"/>
-          <w:szCs w:val="24"/>
-          <w:lang w:val="es-ES"/>
-        </w:rPr>
-        <w:t xml:space="preserve"> </w:t>
-      </w:r>
-      <w:proofErr w:type="spellStart"/>
-      <w:r>
-        <w:rPr>
-          <w:rFonts w:ascii="Times New Roman" w:hAnsi="Times New Roman" w:cs="Times New Roman"/>
-          <w:sz w:val="24"/>
-          <w:szCs w:val="24"/>
-          <w:lang w:val="es-ES"/>
-        </w:rPr>
-        <w:t>texto</w:t>
-      </w:r>
-      <w:proofErr w:type="spellEnd"/>
-      <w:r>
-        <w:rPr>
-          <w:rFonts w:ascii="Times New Roman" w:hAnsi="Times New Roman" w:cs="Times New Roman"/>
-          <w:sz w:val="24"/>
-          <w:szCs w:val="24"/>
-          <w:lang w:val="es-ES"/>
-        </w:rPr>
-        <w:t xml:space="preserve"> </w:t>
-      </w:r>
-      <w:proofErr w:type="spellStart"/>
-      <w:r>
-        <w:rPr>
-          <w:rFonts w:ascii="Times New Roman" w:hAnsi="Times New Roman" w:cs="Times New Roman"/>
-          <w:sz w:val="24"/>
-          <w:szCs w:val="24"/>
-          <w:lang w:val="es-ES"/>
-        </w:rPr>
-        <w:t>texto</w:t>
-      </w:r>
-      <w:proofErr w:type="spellEnd"/>
-      <w:r>
-        <w:rPr>
-          <w:rFonts w:ascii="Times New Roman" w:hAnsi="Times New Roman" w:cs="Times New Roman"/>
-          <w:sz w:val="24"/>
-          <w:szCs w:val="24"/>
-          <w:lang w:val="es-ES"/>
-        </w:rPr>
-        <w:t xml:space="preserve"> </w:t>
-      </w:r>
-      <w:proofErr w:type="spellStart"/>
-      <w:r>
-        <w:rPr>
-          <w:rFonts w:ascii="Times New Roman" w:hAnsi="Times New Roman" w:cs="Times New Roman"/>
-          <w:sz w:val="24"/>
-          <w:szCs w:val="24"/>
-          <w:lang w:val="es-ES"/>
-        </w:rPr>
-        <w:t>texto</w:t>
-      </w:r>
-      <w:proofErr w:type="spellEnd"/>
-      <w:r>
-        <w:rPr>
-          <w:rFonts w:ascii="Times New Roman" w:hAnsi="Times New Roman" w:cs="Times New Roman"/>
-          <w:sz w:val="24"/>
-          <w:szCs w:val="24"/>
-          <w:lang w:val="es-ES"/>
-        </w:rPr>
-        <w:t xml:space="preserve"> </w:t>
-      </w:r>
-      <w:proofErr w:type="spellStart"/>
-      <w:r>
-        <w:rPr>
-          <w:rFonts w:ascii="Times New Roman" w:hAnsi="Times New Roman" w:cs="Times New Roman"/>
-          <w:sz w:val="24"/>
-          <w:szCs w:val="24"/>
-          <w:lang w:val="es-ES"/>
-        </w:rPr>
-        <w:t>texto</w:t>
-      </w:r>
-      <w:proofErr w:type="spellEnd"/>
-      <w:r>
-        <w:rPr>
-          <w:rFonts w:ascii="Times New Roman" w:hAnsi="Times New Roman" w:cs="Times New Roman"/>
-          <w:sz w:val="24"/>
-          <w:szCs w:val="24"/>
-          <w:lang w:val="es-ES"/>
-        </w:rPr>
-        <w:t xml:space="preserve"> </w:t>
-      </w:r>
-      <w:proofErr w:type="spellStart"/>
-      <w:r>
-        <w:rPr>
-          <w:rFonts w:ascii="Times New Roman" w:hAnsi="Times New Roman" w:cs="Times New Roman"/>
-          <w:sz w:val="24"/>
-          <w:szCs w:val="24"/>
-          <w:lang w:val="es-ES"/>
-        </w:rPr>
-        <w:t>texto</w:t>
-      </w:r>
-      <w:proofErr w:type="spellEnd"/>
-      <w:r>
-        <w:rPr>
-          <w:rFonts w:ascii="Times New Roman" w:hAnsi="Times New Roman" w:cs="Times New Roman"/>
-          <w:sz w:val="24"/>
-          <w:szCs w:val="24"/>
-          <w:lang w:val="es-ES"/>
-        </w:rPr>
-        <w:t xml:space="preserve"> </w:t>
-      </w:r>
-      <w:proofErr w:type="spellStart"/>
-      <w:r>
-        <w:rPr>
-          <w:rFonts w:ascii="Times New Roman" w:hAnsi="Times New Roman" w:cs="Times New Roman"/>
-          <w:sz w:val="24"/>
-          <w:szCs w:val="24"/>
-          <w:lang w:val="es-ES"/>
-        </w:rPr>
-        <w:t>texto</w:t>
-      </w:r>
-      <w:proofErr w:type="spellEnd"/>
-      <w:r>
-        <w:rPr>
-          <w:rFonts w:ascii="Times New Roman" w:hAnsi="Times New Roman" w:cs="Times New Roman"/>
-          <w:sz w:val="24"/>
-          <w:szCs w:val="24"/>
-          <w:lang w:val="es-ES"/>
-        </w:rPr>
-        <w:t xml:space="preserve"> </w:t>
-      </w:r>
-      <w:proofErr w:type="spellStart"/>
-      <w:r>
-        <w:rPr>
-          <w:rFonts w:ascii="Times New Roman" w:hAnsi="Times New Roman" w:cs="Times New Roman"/>
-          <w:sz w:val="24"/>
-          <w:szCs w:val="24"/>
-          <w:lang w:val="es-ES"/>
-        </w:rPr>
-        <w:t>texto</w:t>
-      </w:r>
-      <w:proofErr w:type="spellEnd"/>
-      <w:r>
-        <w:rPr>
-          <w:rFonts w:ascii="Times New Roman" w:hAnsi="Times New Roman" w:cs="Times New Roman"/>
-          <w:sz w:val="24"/>
-          <w:szCs w:val="24"/>
-          <w:lang w:val="es-ES"/>
-        </w:rPr>
-        <w:t xml:space="preserve"> </w:t>
-      </w:r>
-      <w:proofErr w:type="spellStart"/>
-      <w:r>
-        <w:rPr>
-          <w:rFonts w:ascii="Times New Roman" w:hAnsi="Times New Roman" w:cs="Times New Roman"/>
-          <w:sz w:val="24"/>
-          <w:szCs w:val="24"/>
-          <w:lang w:val="es-ES"/>
-        </w:rPr>
-        <w:t>texto</w:t>
-      </w:r>
-      <w:proofErr w:type="spellEnd"/>
-      <w:r>
-        <w:rPr>
-          <w:rFonts w:ascii="Times New Roman" w:hAnsi="Times New Roman" w:cs="Times New Roman"/>
-          <w:sz w:val="24"/>
-          <w:szCs w:val="24"/>
-          <w:lang w:val="es-ES"/>
-        </w:rPr>
-        <w:t xml:space="preserve"> </w:t>
-      </w:r>
-      <w:proofErr w:type="spellStart"/>
-      <w:r>
-        <w:rPr>
-          <w:rFonts w:ascii="Times New Roman" w:hAnsi="Times New Roman" w:cs="Times New Roman"/>
-          <w:sz w:val="24"/>
-          <w:szCs w:val="24"/>
-          <w:lang w:val="es-ES"/>
-        </w:rPr>
-        <w:t>texto</w:t>
-      </w:r>
-      <w:proofErr w:type="spellEnd"/>
-      <w:r>
-        <w:rPr>
-          <w:rFonts w:ascii="Times New Roman" w:hAnsi="Times New Roman" w:cs="Times New Roman"/>
-          <w:sz w:val="24"/>
-          <w:szCs w:val="24"/>
-          <w:lang w:val="es-ES"/>
-        </w:rPr>
-        <w:t xml:space="preserve"> </w:t>
-      </w:r>
-      <w:proofErr w:type="spellStart"/>
-      <w:r>
-        <w:rPr>
-          <w:rFonts w:ascii="Times New Roman" w:hAnsi="Times New Roman" w:cs="Times New Roman"/>
-          <w:sz w:val="24"/>
-          <w:szCs w:val="24"/>
-          <w:lang w:val="es-ES"/>
-        </w:rPr>
-        <w:t>texto</w:t>
-      </w:r>
-      <w:proofErr w:type="spellEnd"/>
-      <w:r>
-        <w:rPr>
-          <w:rFonts w:ascii="Times New Roman" w:hAnsi="Times New Roman" w:cs="Times New Roman"/>
-          <w:sz w:val="24"/>
-          <w:szCs w:val="24"/>
-          <w:lang w:val="es-ES"/>
-        </w:rPr>
-        <w:t xml:space="preserve"> </w:t>
-      </w:r>
-      <w:proofErr w:type="spellStart"/>
-      <w:r>
-        <w:rPr>
-          <w:rFonts w:ascii="Times New Roman" w:hAnsi="Times New Roman" w:cs="Times New Roman"/>
-          <w:sz w:val="24"/>
-          <w:szCs w:val="24"/>
-          <w:lang w:val="es-ES"/>
-        </w:rPr>
-        <w:t>texto</w:t>
-      </w:r>
-      <w:proofErr w:type="spellEnd"/>
-      <w:r>
-        <w:rPr>
-          <w:rFonts w:ascii="Times New Roman" w:hAnsi="Times New Roman" w:cs="Times New Roman"/>
-          <w:sz w:val="24"/>
-          <w:szCs w:val="24"/>
-          <w:lang w:val="es-ES"/>
-        </w:rPr>
-        <w:t xml:space="preserve"> </w:t>
-      </w:r>
-      <w:proofErr w:type="spellStart"/>
-      <w:r>
-        <w:rPr>
-          <w:rFonts w:ascii="Times New Roman" w:hAnsi="Times New Roman" w:cs="Times New Roman"/>
-          <w:sz w:val="24"/>
-          <w:szCs w:val="24"/>
-          <w:lang w:val="es-ES"/>
-        </w:rPr>
-        <w:t>texto</w:t>
-      </w:r>
-      <w:proofErr w:type="spellEnd"/>
-      <w:r>
-        <w:rPr>
-          <w:rFonts w:ascii="Times New Roman" w:hAnsi="Times New Roman" w:cs="Times New Roman"/>
-          <w:sz w:val="24"/>
-          <w:szCs w:val="24"/>
-          <w:lang w:val="es-ES"/>
-        </w:rPr>
-        <w:t xml:space="preserve"> </w:t>
-      </w:r>
-      <w:proofErr w:type="spellStart"/>
-      <w:r>
-        <w:rPr>
-          <w:rFonts w:ascii="Times New Roman" w:hAnsi="Times New Roman" w:cs="Times New Roman"/>
-          <w:sz w:val="24"/>
-          <w:szCs w:val="24"/>
-          <w:lang w:val="es-ES"/>
-        </w:rPr>
-        <w:t>texto</w:t>
-      </w:r>
-      <w:proofErr w:type="spellEnd"/>
-      <w:r>
-        <w:rPr>
-          <w:rFonts w:ascii="Times New Roman" w:hAnsi="Times New Roman" w:cs="Times New Roman"/>
-          <w:sz w:val="24"/>
-          <w:szCs w:val="24"/>
-          <w:lang w:val="es-ES"/>
-        </w:rPr>
-        <w:t xml:space="preserve"> </w:t>
-      </w:r>
-      <w:proofErr w:type="spellStart"/>
-      <w:r>
-        <w:rPr>
-          <w:rFonts w:ascii="Times New Roman" w:hAnsi="Times New Roman" w:cs="Times New Roman"/>
-          <w:sz w:val="24"/>
-          <w:szCs w:val="24"/>
-          <w:lang w:val="es-ES"/>
-        </w:rPr>
-        <w:t>texto</w:t>
-      </w:r>
-      <w:proofErr w:type="spellEnd"/>
-      <w:r>
-        <w:rPr>
-          <w:rFonts w:ascii="Times New Roman" w:hAnsi="Times New Roman" w:cs="Times New Roman"/>
-          <w:sz w:val="24"/>
-          <w:szCs w:val="24"/>
-          <w:lang w:val="es-ES"/>
-        </w:rPr>
-        <w:t xml:space="preserve"> </w:t>
-      </w:r>
-      <w:proofErr w:type="spellStart"/>
-      <w:r>
-        <w:rPr>
-          <w:rFonts w:ascii="Times New Roman" w:hAnsi="Times New Roman" w:cs="Times New Roman"/>
-          <w:sz w:val="24"/>
-          <w:szCs w:val="24"/>
-          <w:lang w:val="es-ES"/>
-        </w:rPr>
-        <w:t>texto</w:t>
-      </w:r>
-      <w:proofErr w:type="spellEnd"/>
-      <w:r>
-        <w:rPr>
-          <w:rFonts w:ascii="Times New Roman" w:hAnsi="Times New Roman" w:cs="Times New Roman"/>
-          <w:sz w:val="24"/>
-          <w:szCs w:val="24"/>
-          <w:lang w:val="es-ES"/>
-        </w:rPr>
-        <w:t xml:space="preserve"> </w:t>
-      </w:r>
-      <w:proofErr w:type="spellStart"/>
-      <w:r>
-        <w:rPr>
-          <w:rFonts w:ascii="Times New Roman" w:hAnsi="Times New Roman" w:cs="Times New Roman"/>
-          <w:sz w:val="24"/>
-          <w:szCs w:val="24"/>
-          <w:lang w:val="es-ES"/>
-        </w:rPr>
-        <w:t>texto</w:t>
-      </w:r>
-      <w:proofErr w:type="spellEnd"/>
-      <w:r>
-        <w:rPr>
-          <w:rFonts w:ascii="Times New Roman" w:hAnsi="Times New Roman" w:cs="Times New Roman"/>
-          <w:sz w:val="24"/>
-          <w:szCs w:val="24"/>
-          <w:lang w:val="es-ES"/>
-        </w:rPr>
-        <w:t xml:space="preserve"> </w:t>
-      </w:r>
-      <w:proofErr w:type="spellStart"/>
-      <w:r>
-        <w:rPr>
-          <w:rFonts w:ascii="Times New Roman" w:hAnsi="Times New Roman" w:cs="Times New Roman"/>
-          <w:sz w:val="24"/>
-          <w:szCs w:val="24"/>
-          <w:lang w:val="es-ES"/>
-        </w:rPr>
-        <w:t>texto</w:t>
-      </w:r>
-      <w:proofErr w:type="spellEnd"/>
-      <w:r>
-        <w:rPr>
-          <w:rFonts w:ascii="Times New Roman" w:hAnsi="Times New Roman" w:cs="Times New Roman"/>
-          <w:sz w:val="24"/>
-          <w:szCs w:val="24"/>
-          <w:lang w:val="es-ES"/>
-        </w:rPr>
-        <w:t xml:space="preserve"> </w:t>
-      </w:r>
-      <w:proofErr w:type="spellStart"/>
-      <w:r>
-        <w:rPr>
-          <w:rFonts w:ascii="Times New Roman" w:hAnsi="Times New Roman" w:cs="Times New Roman"/>
-          <w:sz w:val="24"/>
-          <w:szCs w:val="24"/>
-          <w:lang w:val="es-ES"/>
-        </w:rPr>
-        <w:t>texto</w:t>
-      </w:r>
-      <w:proofErr w:type="spellEnd"/>
-      <w:r>
-        <w:rPr>
-          <w:rFonts w:ascii="Times New Roman" w:hAnsi="Times New Roman" w:cs="Times New Roman"/>
-          <w:sz w:val="24"/>
-          <w:szCs w:val="24"/>
-          <w:lang w:val="es-ES"/>
-        </w:rPr>
-        <w:t xml:space="preserve"> </w:t>
-      </w:r>
-      <w:proofErr w:type="spellStart"/>
-      <w:r>
-        <w:rPr>
-          <w:rFonts w:ascii="Times New Roman" w:hAnsi="Times New Roman" w:cs="Times New Roman"/>
-          <w:sz w:val="24"/>
-          <w:szCs w:val="24"/>
-          <w:lang w:val="es-ES"/>
-        </w:rPr>
-        <w:t>texto</w:t>
-      </w:r>
-      <w:proofErr w:type="spellEnd"/>
-      <w:r>
-        <w:rPr>
-          <w:rFonts w:ascii="Times New Roman" w:hAnsi="Times New Roman" w:cs="Times New Roman"/>
-          <w:sz w:val="24"/>
-          <w:szCs w:val="24"/>
-          <w:lang w:val="es-ES"/>
-        </w:rPr>
-        <w:t xml:space="preserve"> </w:t>
-      </w:r>
-      <w:proofErr w:type="spellStart"/>
-      <w:r>
-        <w:rPr>
-          <w:rFonts w:ascii="Times New Roman" w:hAnsi="Times New Roman" w:cs="Times New Roman"/>
-          <w:sz w:val="24"/>
-          <w:szCs w:val="24"/>
-          <w:lang w:val="es-ES"/>
-        </w:rPr>
-        <w:t>texto</w:t>
-      </w:r>
-      <w:proofErr w:type="spellEnd"/>
-      <w:r>
-        <w:rPr>
-          <w:rFonts w:ascii="Times New Roman" w:hAnsi="Times New Roman" w:cs="Times New Roman"/>
-          <w:sz w:val="24"/>
-          <w:szCs w:val="24"/>
-          <w:lang w:val="es-ES"/>
-        </w:rPr>
-        <w:t xml:space="preserve"> </w:t>
-      </w:r>
-      <w:proofErr w:type="spellStart"/>
-      <w:r>
-        <w:rPr>
-          <w:rFonts w:ascii="Times New Roman" w:hAnsi="Times New Roman" w:cs="Times New Roman"/>
-          <w:sz w:val="24"/>
-          <w:szCs w:val="24"/>
-          <w:lang w:val="es-ES"/>
-        </w:rPr>
-        <w:t>texto</w:t>
-      </w:r>
-      <w:proofErr w:type="spellEnd"/>
-      <w:r>
-        <w:rPr>
-          <w:rFonts w:ascii="Times New Roman" w:hAnsi="Times New Roman" w:cs="Times New Roman"/>
-          <w:sz w:val="24"/>
-          <w:szCs w:val="24"/>
-          <w:lang w:val="es-ES"/>
-        </w:rPr>
-        <w:t xml:space="preserve"> </w:t>
+        <w:t xml:space="preserve">Clase de hoy: </w:t>
       </w:r>
     </w:p>
     <w:p>
@@ -1087,6 +271,30 @@
           <w:lang w:val="es-ES"/>
         </w:rPr>
       </w:pPr>
+    </w:p>
+    <w:p>
+      <w:pPr>
+        <w:spacing w:after="0"/>
+        <w:jc w:val="center"/>
+        <w:rPr>
+          <w:rFonts w:ascii="Times New Roman" w:hAnsi="Times New Roman" w:cs="Times New Roman"/>
+          <w:sz w:val="24"/>
+          <w:szCs w:val="24"/>
+          <w:lang w:val="es-ES"/>
+        </w:rPr>
+      </w:pPr>
+    </w:p>
+    <w:p>
+      <w:pPr>
+        <w:spacing w:after="0"/>
+        <w:jc w:val="center"/>
+        <w:rPr>
+          <w:rFonts w:ascii="Times New Roman" w:hAnsi="Times New Roman" w:cs="Times New Roman"/>
+          <w:sz w:val="24"/>
+          <w:szCs w:val="24"/>
+          <w:lang w:val="es-ES"/>
+        </w:rPr>
+      </w:pPr>
       <w:bookmarkStart w:id="0" w:name="_GoBack"/>
       <w:bookmarkEnd w:id="0"/>
     </w:p>
@@ -1474,32 +682,7 @@
         </w:rPr>
       </w:pPr>
     </w:p>
-    <w:p>
-      <w:pPr>
-        <w:spacing w:after="0"/>
-        <w:jc w:val="center"/>
-        <w:rPr>
-          <w:rFonts w:ascii="Times New Roman" w:hAnsi="Times New Roman" w:cs="Times New Roman"/>
-          <w:sz w:val="24"/>
-          <w:szCs w:val="24"/>
-          <w:lang w:val="es-ES"/>
-        </w:rPr>
-      </w:pPr>
-    </w:p>
-    <w:p>
-      <w:pPr>
-        <w:spacing w:after="0"/>
-        <w:jc w:val="center"/>
-        <w:rPr>
-          <w:rFonts w:ascii="Times New Roman" w:hAnsi="Times New Roman" w:cs="Times New Roman"/>
-          <w:sz w:val="24"/>
-          <w:szCs w:val="24"/>
-          <w:lang w:val="es-ES"/>
-        </w:rPr>
-      </w:pPr>
-    </w:p>
     <w:sectPr>
-      <w:headerReference w:type="default" r:id="rId6"/>
       <w:footerReference w:type="default" r:id="rId7"/>
       <w:pgSz w:w="12240" w:h="15840"/>
       <w:pgMar w:top="1417" w:right="1701" w:bottom="1417" w:left="1701" w:header="708" w:footer="708" w:gutter="0"/>
@@ -1549,13 +732,7 @@
       <w:rPr>
         <w:lang w:val="es-ES"/>
       </w:rPr>
-      <w:t xml:space="preserve">Alumno: </w:t>
-    </w:r>
-    <w:r>
-      <w:rPr>
-        <w:lang w:val="es-ES"/>
-      </w:rPr>
-      <w:t>_____________</w:t>
+      <w:t>Alumno: _____________</w:t>
     </w:r>
     <w:r>
       <w:rPr>
@@ -1597,38 +774,6 @@
     </w:p>
   </w:footnote>
 </w:footnotes>
-</file>
-
-<file path=word/header1.xml><?xml version="1.0" encoding="utf-8"?>
-<w:hdr xmlns:wpc="http://schemas.microsoft.com/office/word/2010/wordprocessingCanvas" xmlns:cx="http://schemas.microsoft.com/office/drawing/2014/chartex" xmlns:mc="http://schemas.openxmlformats.org/markup-compatibility/2006" xmlns:o="urn:schemas-microsoft-com:office:office" xmlns:r="http://schemas.openxmlformats.org/officeDocument/2006/relationships" xmlns:m="http://schemas.openxmlformats.org/officeDocument/2006/math" xmlns:v="urn:schemas-microsoft-com:vml" xmlns:wp14="http://schemas.microsoft.com/office/word/2010/wordprocessingDrawing" xmlns:wp="http://schemas.openxmlformats.org/drawingml/2006/wordprocessingDrawing" xmlns:w10="urn:schemas-microsoft-com:office:word" xmlns:w="http://schemas.openxmlformats.org/wordprocessingml/2006/main" xmlns:w14="http://schemas.microsoft.com/office/word/2010/wordml" xmlns:w15="http://schemas.microsoft.com/office/word/2012/wordml" xmlns:w16se="http://schemas.microsoft.com/office/word/2015/wordml/symex" xmlns:wpg="http://schemas.microsoft.com/office/word/2010/wordprocessingGroup" xmlns:wpi="http://schemas.microsoft.com/office/word/2010/wordprocessingInk" xmlns:wne="http://schemas.microsoft.com/office/word/2006/wordml" xmlns:wps="http://schemas.microsoft.com/office/word/2010/wordprocessingShape" mc:Ignorable="w14 w15 w16se wp14">
-  <w:p>
-    <w:pPr>
-      <w:pStyle w:val="Encabezado"/>
-      <w:rPr>
-        <w:lang w:val="es-ES"/>
-      </w:rPr>
-    </w:pPr>
-    <w:r>
-      <w:rPr>
-        <w:lang w:val="es-ES"/>
-      </w:rPr>
-      <w:t xml:space="preserve">Clase nº </w:t>
-    </w:r>
-    <w:r>
-      <w:rPr>
-        <w:lang w:val="es-ES"/>
-      </w:rPr>
-      <w:tab/>
-    </w:r>
-    <w:r>
-      <w:rPr>
-        <w:lang w:val="es-ES"/>
-      </w:rPr>
-      <w:tab/>
-      <w:t xml:space="preserve">fecha de hoy: </w:t>
-    </w:r>
-  </w:p>
-</w:hdr>
 </file>
 
 <file path=word/styles.xml><?xml version="1.0" encoding="utf-8"?>

</xml_diff>